<commit_message>
feat: add CW# keyword; post-generation missing-fields summary popup
</commit_message>
<xml_diff>
--- a/data/template/iCertis Template.Docx
+++ b/data/template/iCertis Template.Docx
@@ -134,6 +134,14 @@
               </w:r>
             </w:sdtContent>
           </w:sdt>
+          <w:r>
+            <w:rPr>
+              <w:rFonts w:hint="eastAsia"/>
+              <w:caps/>
+              <w:lang w:eastAsia="zh-TW"/>
+            </w:rPr>
+            <w:t xml:space="preserve"> (CW#)</w:t>
+          </w:r>
         </w:p>
       </w:sdtContent>
     </w:sdt>
@@ -646,13 +654,7 @@
                 <w:t xml:space="preserve"> in good funds </w:t>
               </w:r>
               <w:r>
-                <w:rPr>
-                  <w:highlight w:val="yellow"/>
-                </w:rPr>
-                <w:t>[by insert date MM, DD, YYYY or insert due date for Settlement Payment for example: within thirty (30) days following execution of this Settlement Form]</w:t>
-              </w:r>
-              <w:r>
-                <w:t xml:space="preserve"> (the “Settlement Payment”).</w:t>
+                <w:t>in accordance with the payment terms of the Base Agreement (the “Settlement Payment”).</w:t>
               </w:r>
             </w:p>
           </w:sdtContent>
@@ -1025,6 +1027,7 @@
                       <w:docPart w:val="DD84A58F63E544808E97D1FA54DA7443"/>
                     </w:placeholder>
                   </w:sdtPr>
+                  <w:sdtEndPr/>
                   <w:sdtContent>
                     <w:proofErr w:type="spellStart"/>
                     <w:r>
@@ -7815,18 +7818,22 @@
     <w:rsidRoot w:val="00665CAE"/>
     <w:rsid w:val="0009201D"/>
     <w:rsid w:val="00096E5C"/>
+    <w:rsid w:val="00115730"/>
+    <w:rsid w:val="001E0423"/>
     <w:rsid w:val="001F6F70"/>
     <w:rsid w:val="00383022"/>
     <w:rsid w:val="003B6657"/>
     <w:rsid w:val="003D636B"/>
     <w:rsid w:val="004E6B29"/>
     <w:rsid w:val="00665CAE"/>
+    <w:rsid w:val="00715CC8"/>
     <w:rsid w:val="00735B9C"/>
     <w:rsid w:val="007A7A78"/>
     <w:rsid w:val="00922E77"/>
     <w:rsid w:val="00A46B40"/>
     <w:rsid w:val="00C565EF"/>
     <w:rsid w:val="00DC6AD3"/>
+    <w:rsid w:val="00FB2362"/>
   </w:rsids>
   <m:mathPr>
     <m:mathFont m:val="Cambria Math"/>
@@ -8337,20 +8344,6 @@
       <w:lang w:val="en-US" w:eastAsia="zh-TW"/>
     </w:rPr>
   </w:style>
-  <w:style w:type="paragraph" w:customStyle="1" w:styleId="5AED4EFF0E684840918AD6CC37AB475D">
-    <w:name w:val="5AED4EFF0E684840918AD6CC37AB475D"/>
-    <w:rsid w:val="004E6B29"/>
-    <w:rPr>
-      <w:lang w:val="en-US" w:eastAsia="zh-TW"/>
-    </w:rPr>
-  </w:style>
-  <w:style w:type="paragraph" w:customStyle="1" w:styleId="CC4908CF5A9C424BB2E9683DC137C2A2">
-    <w:name w:val="CC4908CF5A9C424BB2E9683DC137C2A2"/>
-    <w:rsid w:val="004E6B29"/>
-    <w:rPr>
-      <w:lang w:val="en-US" w:eastAsia="zh-TW"/>
-    </w:rPr>
-  </w:style>
   <w:style w:type="paragraph" w:customStyle="1" w:styleId="DD84A58F63E544808E97D1FA54DA7443">
     <w:name w:val="DD84A58F63E544808E97D1FA54DA7443"/>
     <w:rsid w:val="001F6F70"/>
@@ -8664,15 +8657,6 @@
 </file>
 
 <file path=customXml/item1.xml><?xml version="1.0" encoding="utf-8"?>
-<?mso-contentType ?>
-<FormTemplates xmlns="http://schemas.microsoft.com/sharepoint/v3/contenttype/forms">
-  <Display>DocumentLibraryForm</Display>
-  <Edit>DocumentLibraryForm</Edit>
-  <New>DocumentLibraryForm</New>
-</FormTemplates>
-</file>
-
-<file path=customXml/item2.xml><?xml version="1.0" encoding="utf-8"?>
 <ct:contentTypeSchema xmlns:ct="http://schemas.microsoft.com/office/2006/metadata/contentType" xmlns:ma="http://schemas.microsoft.com/office/2006/metadata/properties/metaAttributes" ct:_="" ma:_="" ma:contentTypeName="Document" ma:contentTypeID="0x010100C7BB62D9C7AC4249BB50D4F119F8FF50" ma:contentTypeVersion="14" ma:contentTypeDescription="Create a new document." ma:contentTypeScope="" ma:versionID="dab14850594d04436880d3464ba468af">
   <xsd:schema xmlns:xsd="http://www.w3.org/2001/XMLSchema" xmlns:xs="http://www.w3.org/2001/XMLSchema" xmlns:p="http://schemas.microsoft.com/office/2006/metadata/properties" xmlns:ns2="3ddbdfa1-be50-4b7a-b66f-14c4748c8596" xmlns:ns3="2df2684a-2237-489e-8795-1f946593e18f" targetNamespace="http://schemas.microsoft.com/office/2006/metadata/properties" ma:root="true" ma:fieldsID="eb8d2f689c1774a9065a5e99593f72e7" ns2:_="" ns3:_="">
     <xsd:import namespace="3ddbdfa1-be50-4b7a-b66f-14c4748c8596"/>
@@ -8901,7 +8885,7 @@
 </ct:contentTypeSchema>
 </file>
 
-<file path=customXml/item3.xml><?xml version="1.0" encoding="utf-8"?>
+<file path=customXml/item2.xml><?xml version="1.0" encoding="utf-8"?>
 <p:properties xmlns:p="http://schemas.microsoft.com/office/2006/metadata/properties" xmlns:xsi="http://www.w3.org/2001/XMLSchema-instance" xmlns:pc="http://schemas.microsoft.com/office/infopath/2007/PartnerControls">
   <documentManagement>
     <TaxCatchAll xmlns="2df2684a-2237-489e-8795-1f946593e18f" xsi:nil="true"/>
@@ -8912,15 +8896,16 @@
 </p:properties>
 </file>
 
-<file path=customXml/itemProps1.xml><?xml version="1.0" encoding="utf-8"?>
-<ds:datastoreItem xmlns:ds="http://schemas.openxmlformats.org/officeDocument/2006/customXml" ds:itemID="{89D1A37C-F18D-42B3-84A5-AC6F89F7000D}">
-  <ds:schemaRefs>
-    <ds:schemaRef ds:uri="http://schemas.microsoft.com/sharepoint/v3/contenttype/forms"/>
-  </ds:schemaRefs>
-</ds:datastoreItem>
+<file path=customXml/item3.xml><?xml version="1.0" encoding="utf-8"?>
+<?mso-contentType ?>
+<FormTemplates xmlns="http://schemas.microsoft.com/sharepoint/v3/contenttype/forms">
+  <Display>DocumentLibraryForm</Display>
+  <Edit>DocumentLibraryForm</Edit>
+  <New>DocumentLibraryForm</New>
+</FormTemplates>
 </file>
 
-<file path=customXml/itemProps2.xml><?xml version="1.0" encoding="utf-8"?>
+<file path=customXml/itemProps1.xml><?xml version="1.0" encoding="utf-8"?>
 <ds:datastoreItem xmlns:ds="http://schemas.openxmlformats.org/officeDocument/2006/customXml" ds:itemID="{A8AF6D02-E60D-4694-9AC7-4C3F5E56AF6C}">
   <ds:schemaRefs>
     <ds:schemaRef ds:uri="http://schemas.microsoft.com/office/2006/metadata/contentType"/>
@@ -8939,7 +8924,7 @@
 </ds:datastoreItem>
 </file>
 
-<file path=customXml/itemProps3.xml><?xml version="1.0" encoding="utf-8"?>
+<file path=customXml/itemProps2.xml><?xml version="1.0" encoding="utf-8"?>
 <ds:datastoreItem xmlns:ds="http://schemas.openxmlformats.org/officeDocument/2006/customXml" ds:itemID="{46649514-DDD7-4D7B-8E81-3FCE49532641}">
   <ds:schemaRefs>
     <ds:schemaRef ds:uri="http://schemas.microsoft.com/office/2006/metadata/properties"/>
@@ -8948,4 +8933,12 @@
     <ds:schemaRef ds:uri="3ddbdfa1-be50-4b7a-b66f-14c4748c8596"/>
   </ds:schemaRefs>
 </ds:datastoreItem>
+</file>
+
+<file path=customXml/itemProps3.xml><?xml version="1.0" encoding="utf-8"?>
+<ds:datastoreItem xmlns:ds="http://schemas.openxmlformats.org/officeDocument/2006/customXml" ds:itemID="{89D1A37C-F18D-42B3-84A5-AC6F89F7000D}">
+  <ds:schemaRefs>
+    <ds:schemaRef ds:uri="http://schemas.microsoft.com/sharepoint/v3/contenttype/forms"/>
+  </ds:schemaRefs>
+</ds:datastoreItem>
 </file>
</xml_diff>